<commit_message>
responsivo pro mobile, recibo_1 verificado
</commit_message>
<xml_diff>
--- a/resources/templates/recibo_1.docx
+++ b/resources/templates/recibo_1.docx
@@ -1,20 +1,29 @@
 
 <file path=word/document.xml><?xml version="1.0" encoding="utf-8"?>
-<w:document xmlns:wpc="http://schemas.microsoft.com/office/word/2010/wordprocessingCanvas" xmlns:cx="http://schemas.microsoft.com/office/drawing/2014/chartex" xmlns:cx1="http://schemas.microsoft.com/office/drawing/2015/9/8/chartex" xmlns:cx2="http://schemas.microsoft.com/office/drawing/2015/10/21/chartex" xmlns:cx3="http://schemas.microsoft.com/office/drawing/2016/5/9/chartex" xmlns:cx4="http://schemas.microsoft.com/office/drawing/2016/5/10/chartex" xmlns:cx5="http://schemas.microsoft.com/office/drawing/2016/5/11/chartex" xmlns:cx6="http://schemas.microsoft.com/office/drawing/2016/5/12/chartex" xmlns:cx7="http://schemas.microsoft.com/office/drawing/2016/5/13/chartex" xmlns:cx8="http://schemas.microsoft.com/office/drawing/2016/5/14/chartex" xmlns:mc="http://schemas.openxmlformats.org/markup-compatibility/2006" xmlns:aink="http://schemas.microsoft.com/office/drawing/2016/ink" xmlns:am3d="http://schemas.microsoft.com/office/drawing/2017/model3d" xmlns:o="urn:schemas-microsoft-com:office:office" xmlns:oel="http://schemas.microsoft.com/office/2019/extlst" xmlns:r="http://schemas.openxmlformats.org/officeDocument/2006/relationships" xmlns:m="http://schemas.openxmlformats.org/officeDocument/2006/math" xmlns:v="urn:schemas-microsoft-com:vml" xmlns:wp14="http://schemas.microsoft.com/office/word/2010/wordprocessingDrawing" xmlns:wp="http://schemas.openxmlformats.org/drawingml/2006/wordprocessingDrawing" xmlns:w10="urn:schemas-microsoft-com:office:word" xmlns:w="http://schemas.openxmlformats.org/wordprocessingml/2006/main" xmlns:w14="http://schemas.microsoft.com/office/word/2010/wordml" xmlns:w15="http://schemas.microsoft.com/office/word/2012/wordml" xmlns:w16cex="http://schemas.microsoft.com/office/word/2018/wordml/cex" xmlns:w16cid="http://schemas.microsoft.com/office/word/2016/wordml/cid" xmlns:w16="http://schemas.microsoft.com/office/word/2018/wordml" xmlns:w16du="http://schemas.microsoft.com/office/word/2023/wordml/word16du" xmlns:w16sdtdh="http://schemas.microsoft.com/office/word/2020/wordml/sdtdatahash" xmlns:w16sdtfl="http://schemas.microsoft.com/office/word/2024/wordml/sdtformatlock" xmlns:w16se="http://schemas.microsoft.com/office/word/2015/wordml/symex" xmlns:wpg="http://schemas.microsoft.com/office/word/2010/wordprocessingGroup" xmlns:wpi="http://schemas.microsoft.com/office/word/2010/wordprocessingInk" xmlns:wne="http://schemas.microsoft.com/office/word/2006/wordml" xmlns:wps="http://schemas.microsoft.com/office/word/2010/wordprocessingShape" mc:Ignorable="w14 w15 w16se w16cid w16 w16cex w16sdtdh w16sdtfl w16du wp14">
+<w:document xmlns:o="urn:schemas-microsoft-com:office:office" xmlns:r="http://schemas.openxmlformats.org/officeDocument/2006/relationships" xmlns:v="urn:schemas-microsoft-com:vml" xmlns:w="http://schemas.openxmlformats.org/wordprocessingml/2006/main" xmlns:w10="urn:schemas-microsoft-com:office:word" xmlns:wp="http://schemas.openxmlformats.org/drawingml/2006/wordprocessingDrawing" xmlns:wps="http://schemas.microsoft.com/office/word/2010/wordprocessingShape" xmlns:wpg="http://schemas.microsoft.com/office/word/2010/wordprocessingGroup" xmlns:mc="http://schemas.openxmlformats.org/markup-compatibility/2006" xmlns:wp14="http://schemas.microsoft.com/office/word/2010/wordprocessingDrawing" xmlns:w14="http://schemas.microsoft.com/office/word/2010/wordml" xmlns:w15="http://schemas.microsoft.com/office/word/2012/wordml" mc:Ignorable="w14 wp14 w15">
   <w:body>
     <w:tbl>
       <w:tblPr>
-        <w:tblpPr w:leftFromText="141" w:rightFromText="141" w:vertAnchor="page" w:horzAnchor="margin" w:tblpY="931"/>
+        <w:tblpPr w:vertAnchor="page" w:horzAnchor="margin" w:leftFromText="141" w:rightFromText="141" w:tblpX="0" w:tblpY="931"/>
         <w:tblW w:w="9230" w:type="dxa"/>
-        <w:tblLook w:val="0000" w:firstRow="0" w:lastRow="0" w:firstColumn="0" w:lastColumn="0" w:noHBand="0" w:noVBand="0"/>
+        <w:jc w:val="left"/>
+        <w:tblInd w:w="108" w:type="dxa"/>
+        <w:tblLayout w:type="fixed"/>
+        <w:tblCellMar>
+          <w:top w:w="0" w:type="dxa"/>
+          <w:left w:w="108" w:type="dxa"/>
+          <w:bottom w:w="0" w:type="dxa"/>
+          <w:right w:w="108" w:type="dxa"/>
+        </w:tblCellMar>
+        <w:tblLook w:val="0000" w:noHBand="0" w:noVBand="0" w:firstColumn="0" w:lastRow="0" w:lastColumn="0" w:firstRow="0"/>
       </w:tblPr>
       <w:tblGrid>
-        <w:gridCol w:w="4604"/>
+        <w:gridCol w:w="4603"/>
         <w:gridCol w:w="4626"/>
       </w:tblGrid>
       <w:tr>
         <w:trPr>
-          <w:trHeight w:val="2688"/>
+          <w:trHeight w:val="3000" w:hRule="atLeast"/>
         </w:trPr>
         <w:tc>
           <w:tcPr>
@@ -29,6 +38,7 @@
           </w:tcPr>
           <w:p>
             <w:pPr>
+              <w:pStyle w:val="Normal"/>
               <w:jc w:val="left"/>
               <w:rPr>
                 <w:b/>
@@ -38,14 +48,12 @@
               </w:rPr>
             </w:pPr>
             <w:r>
-              <w:rPr>
-                <w:noProof/>
-              </w:rPr>
+              <w:rPr/>
               <w:drawing>
-                <wp:inline distT="0" distB="0" distL="0" distR="0" wp14:anchorId="51CF6D92" wp14:editId="1DAB6CFB">
+                <wp:inline distT="0" distB="0" distL="0" distR="0">
                   <wp:extent cx="1997075" cy="1276350"/>
                   <wp:effectExtent l="0" t="0" r="0" b="0"/>
-                  <wp:docPr id="1" name="Figura1"/>
+                  <wp:docPr id="1" name="Figura1" descr=""/>
                   <wp:cNvGraphicFramePr>
                     <a:graphicFrameLocks xmlns:a="http://schemas.openxmlformats.org/drawingml/2006/main" noChangeAspect="1"/>
                   </wp:cNvGraphicFramePr>
@@ -53,13 +61,13 @@
                     <a:graphicData uri="http://schemas.openxmlformats.org/drawingml/2006/picture">
                       <pic:pic xmlns:pic="http://schemas.openxmlformats.org/drawingml/2006/picture">
                         <pic:nvPicPr>
-                          <pic:cNvPr id="1" name="Figura1"/>
+                          <pic:cNvPr id="1" name="Figura1" descr=""/>
                           <pic:cNvPicPr>
                             <a:picLocks noChangeAspect="1" noChangeArrowheads="1"/>
                           </pic:cNvPicPr>
                         </pic:nvPicPr>
                         <pic:blipFill>
-                          <a:blip r:embed="rId4"/>
+                          <a:blip r:embed="rId2"/>
                           <a:stretch>
                             <a:fillRect/>
                           </a:stretch>
@@ -80,197 +88,368 @@
               </w:drawing>
             </w:r>
             <w:r>
-              <w:rPr>
-                <w:noProof/>
-              </w:rPr>
-              <w:pict w14:anchorId="2C5AE37E">
-                <v:shapetype id="_x0000_t202" coordsize="21600,21600" o:spt="202" path="m,l,21600r21600,l21600,xe">
-                  <v:stroke joinstyle="miter"/>
-                  <v:path gradientshapeok="t" o:connecttype="rect"/>
-                </v:shapetype>
-                <v:shape id="Caixa de Texto 2" o:spid="_x0000_s1026" type="#_x0000_t202" style="position:absolute;margin-left:160.2pt;margin-top:3.7pt;width:294pt;height:125.55pt;z-index:2;visibility:visible;mso-wrap-style:square;mso-wrap-distance-left:9pt;mso-wrap-distance-top:0;mso-wrap-distance-right:9pt;mso-wrap-distance-bottom:0;mso-position-horizontal:absolute;mso-position-horizontal-relative:text;mso-position-vertical:absolute;mso-position-vertical-relative:text;v-text-anchor:top" o:gfxdata="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" strokecolor="white" strokeweight=".05pt">
-                  <v:textbox style="mso-next-textbox:#Caixa de Texto 2">
-                    <w:txbxContent>
-                      <w:p>
-                        <w:pPr>
-                          <w:pStyle w:val="FrameContents"/>
-                          <w:jc w:val="center"/>
-                        </w:pPr>
-                        <w:r>
-                          <w:rPr>
-                            <w:b/>
-                            <w:sz w:val="20"/>
-                          </w:rPr>
-                          <w:t>COLÔNIA DOS PESCADORES PROFISSIONAIS DE</w:t>
-                        </w:r>
-                      </w:p>
-                      <w:p>
-                        <w:pPr>
-                          <w:pStyle w:val="FrameContents"/>
-                          <w:jc w:val="center"/>
-                          <w:rPr>
-                            <w:b/>
-                            <w:sz w:val="20"/>
-                          </w:rPr>
-                        </w:pPr>
-                        <w:r>
-                          <w:rPr>
-                            <w:b/>
-                            <w:sz w:val="20"/>
-                          </w:rPr>
-                          <w:t>FRUTAL E REGIÃO Z -18</w:t>
-                        </w:r>
-                      </w:p>
-                      <w:p>
-                        <w:pPr>
-                          <w:pStyle w:val="FrameContents"/>
-                          <w:jc w:val="center"/>
-                          <w:rPr>
-                            <w:b/>
-                            <w:sz w:val="22"/>
-                            <w:szCs w:val="22"/>
-                          </w:rPr>
-                        </w:pPr>
-                        <w:r>
-                          <w:rPr>
-                            <w:b/>
-                            <w:sz w:val="22"/>
-                            <w:szCs w:val="22"/>
-                          </w:rPr>
-                          <w:t xml:space="preserve">R: São Franc. De Sales, </w:t>
-                        </w:r>
-                        <w:proofErr w:type="gramStart"/>
-                        <w:r>
-                          <w:rPr>
-                            <w:b/>
-                            <w:sz w:val="22"/>
-                            <w:szCs w:val="22"/>
-                          </w:rPr>
-                          <w:t>N.º</w:t>
-                        </w:r>
-                        <w:proofErr w:type="gramEnd"/>
-                        <w:r>
-                          <w:rPr>
-                            <w:b/>
-                            <w:sz w:val="22"/>
-                            <w:szCs w:val="22"/>
-                          </w:rPr>
-                          <w:t xml:space="preserve">1048 – Progresso </w:t>
-                        </w:r>
-                      </w:p>
-                      <w:p>
-                        <w:pPr>
-                          <w:pStyle w:val="FrameContents"/>
-                          <w:jc w:val="center"/>
-                          <w:rPr>
-                            <w:sz w:val="20"/>
-                          </w:rPr>
-                        </w:pPr>
-                        <w:r>
-                          <w:rPr>
-                            <w:b/>
-                            <w:sz w:val="20"/>
-                          </w:rPr>
-                          <w:t>CEP: 38.200 – 000</w:t>
-                        </w:r>
-                      </w:p>
-                      <w:p>
-                        <w:pPr>
-                          <w:pStyle w:val="FrameContents"/>
-                          <w:tabs>
-                            <w:tab w:val="left" w:pos="1263"/>
-                            <w:tab w:val="center" w:pos="4472"/>
-                          </w:tabs>
-                          <w:jc w:val="center"/>
-                          <w:rPr>
-                            <w:sz w:val="22"/>
-                            <w:szCs w:val="22"/>
-                          </w:rPr>
-                        </w:pPr>
-                        <w:r>
-                          <w:rPr>
-                            <w:rFonts w:ascii="Monotype Corsiva" w:hAnsi="Monotype Corsiva" w:cs="Monotype Corsiva"/>
-                            <w:b/>
-                            <w:i/>
-                            <w:sz w:val="22"/>
-                            <w:szCs w:val="22"/>
-                          </w:rPr>
-                          <w:t>Tel./ (0xx34) 3423-6691</w:t>
-                        </w:r>
-                      </w:p>
-                      <w:p>
-                        <w:pPr>
-                          <w:pStyle w:val="FrameContents"/>
-                          <w:tabs>
-                            <w:tab w:val="left" w:pos="1263"/>
-                            <w:tab w:val="center" w:pos="4472"/>
-                          </w:tabs>
-                          <w:jc w:val="center"/>
-                          <w:rPr>
-                            <w:sz w:val="20"/>
-                          </w:rPr>
-                        </w:pPr>
-                        <w:proofErr w:type="gramStart"/>
-                        <w:r>
-                          <w:rPr>
-                            <w:rFonts w:ascii="Monotype Corsiva" w:hAnsi="Monotype Corsiva" w:cs="Monotype Corsiva"/>
-                            <w:b/>
-                            <w:i/>
-                            <w:sz w:val="20"/>
-                          </w:rPr>
-                          <w:t>CNPJ  nº</w:t>
-                        </w:r>
-                        <w:proofErr w:type="gramEnd"/>
-                        <w:r>
-                          <w:rPr>
-                            <w:rFonts w:ascii="Monotype Corsiva" w:hAnsi="Monotype Corsiva" w:cs="Monotype Corsiva"/>
-                            <w:b/>
-                            <w:i/>
-                            <w:sz w:val="20"/>
-                          </w:rPr>
-                          <w:t>. 07.500.616/0001-70</w:t>
-                        </w:r>
-                      </w:p>
-                      <w:p>
-                        <w:pPr>
-                          <w:pStyle w:val="FrameContents"/>
-                          <w:jc w:val="center"/>
-                          <w:rPr>
-                            <w:rFonts w:ascii="Monotype Corsiva" w:hAnsi="Monotype Corsiva" w:cs="Monotype Corsiva"/>
-                            <w:b/>
-                            <w:i/>
-                            <w:sz w:val="22"/>
-                            <w:szCs w:val="22"/>
-                          </w:rPr>
-                        </w:pPr>
-                        <w:r>
-                          <w:rPr>
-                            <w:rFonts w:ascii="Monotype Corsiva" w:hAnsi="Monotype Corsiva" w:cs="Monotype Corsiva"/>
-                            <w:b/>
-                            <w:i/>
-                            <w:sz w:val="22"/>
-                            <w:szCs w:val="22"/>
-                          </w:rPr>
-                          <w:t>Presidente Fundadora – DABIANE LUZ CLEMENTE</w:t>
-                        </w:r>
-                      </w:p>
-                      <w:p>
-                        <w:pPr>
-                          <w:pStyle w:val="FrameContents"/>
-                        </w:pPr>
-                      </w:p>
-                    </w:txbxContent>
-                  </v:textbox>
-                </v:shape>
-              </w:pict>
+              <mc:AlternateContent>
+                <mc:Choice Requires="wps">
+                  <w:drawing>
+                    <wp:anchor behindDoc="0" distT="0" distB="0" distL="114300" distR="114300" simplePos="0" locked="0" layoutInCell="1" allowOverlap="1" relativeHeight="4">
+                      <wp:simplePos x="0" y="0"/>
+                      <wp:positionH relativeFrom="column">
+                        <wp:posOffset>1996440</wp:posOffset>
+                      </wp:positionH>
+                      <wp:positionV relativeFrom="paragraph">
+                        <wp:posOffset>46990</wp:posOffset>
+                      </wp:positionV>
+                      <wp:extent cx="3733800" cy="1842770"/>
+                      <wp:effectExtent l="0" t="0" r="0" b="0"/>
+                      <wp:wrapNone/>
+                      <wp:docPr id="2" name="Quadro1"/>
+                      <a:graphic xmlns:a="http://schemas.openxmlformats.org/drawingml/2006/main">
+                        <a:graphicData uri="http://schemas.microsoft.com/office/word/2010/wordprocessingShape">
+                          <wps:wsp>
+                            <wps:cNvSpPr txBox="1"/>
+                            <wps:spPr>
+                              <a:xfrm>
+                                <a:off x="0" y="0"/>
+                                <a:ext cx="3733800" cy="1842770"/>
+                              </a:xfrm>
+                              <a:prstGeom prst="rect"/>
+                              <a:solidFill>
+                                <a:srgbClr val="FFFFFF"/>
+                              </a:solidFill>
+                              <a:ln>
+                                <a:solidFill>
+                                  <a:srgbClr val="FFFFFF"/>
+                                </a:solidFill>
+                              </a:ln>
+                            </wps:spPr>
+                            <wps:txbx>
+                              <w:txbxContent>
+                                <w:p>
+                                  <w:pPr>
+                                    <w:pStyle w:val="FrameContents"/>
+                                    <w:jc w:val="center"/>
+                                    <w:rPr/>
+                                  </w:pPr>
+                                  <w:r>
+                                    <w:rPr>
+                                      <w:b/>
+                                      <w:sz w:val="20"/>
+                                    </w:rPr>
+                                    <w:t>COLÔNIA DOS PESCADORES PROFISSIONAIS DE</w:t>
+                                  </w:r>
+                                </w:p>
+                                <w:p>
+                                  <w:pPr>
+                                    <w:pStyle w:val="FrameContents"/>
+                                    <w:jc w:val="center"/>
+                                    <w:rPr>
+                                      <w:b/>
+                                      <w:sz w:val="20"/>
+                                    </w:rPr>
+                                  </w:pPr>
+                                  <w:r>
+                                    <w:rPr>
+                                      <w:b/>
+                                      <w:sz w:val="20"/>
+                                    </w:rPr>
+                                    <w:t>FRUTAL E REGIÃO Z -18</w:t>
+                                  </w:r>
+                                </w:p>
+                                <w:p>
+                                  <w:pPr>
+                                    <w:pStyle w:val="FrameContents"/>
+                                    <w:jc w:val="center"/>
+                                    <w:rPr>
+                                      <w:b/>
+                                      <w:sz w:val="22"/>
+                                      <w:szCs w:val="22"/>
+                                    </w:rPr>
+                                  </w:pPr>
+                                  <w:r>
+                                    <w:rPr>
+                                      <w:b/>
+                                      <w:sz w:val="22"/>
+                                      <w:szCs w:val="22"/>
+                                    </w:rPr>
+                                    <w:t>R: São Franc. De Sales, N.º1048 – Progresso</w:t>
+                                  </w:r>
+                                </w:p>
+                                <w:p>
+                                  <w:pPr>
+                                    <w:pStyle w:val="FrameContents"/>
+                                    <w:jc w:val="center"/>
+                                    <w:rPr>
+                                      <w:sz w:val="20"/>
+                                    </w:rPr>
+                                  </w:pPr>
+                                  <w:r>
+                                    <w:rPr>
+                                      <w:b/>
+                                      <w:sz w:val="20"/>
+                                    </w:rPr>
+                                    <w:t>CEP: 38.200 – 000</w:t>
+                                  </w:r>
+                                </w:p>
+                                <w:p>
+                                  <w:pPr>
+                                    <w:pStyle w:val="FrameContents"/>
+                                    <w:tabs>
+                                      <w:tab w:val="clear" w:pos="708"/>
+                                      <w:tab w:val="left" w:pos="1263" w:leader="none"/>
+                                      <w:tab w:val="center" w:pos="4472" w:leader="none"/>
+                                    </w:tabs>
+                                    <w:jc w:val="center"/>
+                                    <w:rPr>
+                                      <w:sz w:val="22"/>
+                                      <w:szCs w:val="22"/>
+                                    </w:rPr>
+                                  </w:pPr>
+                                  <w:r>
+                                    <w:rPr>
+                                      <w:rFonts w:cs="Monotype Corsiva" w:ascii="Monotype Corsiva" w:hAnsi="Monotype Corsiva"/>
+                                      <w:b/>
+                                      <w:i/>
+                                      <w:sz w:val="22"/>
+                                      <w:szCs w:val="22"/>
+                                    </w:rPr>
+                                    <w:t>Tel./ (0xx34) 3423-6691</w:t>
+                                  </w:r>
+                                </w:p>
+                                <w:p>
+                                  <w:pPr>
+                                    <w:pStyle w:val="FrameContents"/>
+                                    <w:tabs>
+                                      <w:tab w:val="clear" w:pos="708"/>
+                                      <w:tab w:val="left" w:pos="1263" w:leader="none"/>
+                                      <w:tab w:val="center" w:pos="4472" w:leader="none"/>
+                                    </w:tabs>
+                                    <w:jc w:val="center"/>
+                                    <w:rPr>
+                                      <w:sz w:val="20"/>
+                                    </w:rPr>
+                                  </w:pPr>
+                                  <w:r>
+                                    <w:rPr>
+                                      <w:rFonts w:cs="Monotype Corsiva" w:ascii="Monotype Corsiva" w:hAnsi="Monotype Corsiva"/>
+                                      <w:b/>
+                                      <w:i/>
+                                      <w:sz w:val="20"/>
+                                    </w:rPr>
+                                    <w:t>CNPJ  nº. 07.500.616/0001-70</w:t>
+                                  </w:r>
+                                </w:p>
+                                <w:p>
+                                  <w:pPr>
+                                    <w:pStyle w:val="FrameContents"/>
+                                    <w:jc w:val="center"/>
+                                    <w:rPr>
+                                      <w:rFonts w:ascii="Monotype Corsiva" w:hAnsi="Monotype Corsiva" w:cs="Monotype Corsiva"/>
+                                      <w:b/>
+                                      <w:i/>
+                                      <w:i/>
+                                      <w:sz w:val="22"/>
+                                      <w:szCs w:val="22"/>
+                                    </w:rPr>
+                                  </w:pPr>
+                                  <w:r>
+                                    <w:rPr>
+                                      <w:rFonts w:cs="Monotype Corsiva" w:ascii="Monotype Corsiva" w:hAnsi="Monotype Corsiva"/>
+                                      <w:b/>
+                                      <w:i/>
+                                      <w:sz w:val="22"/>
+                                      <w:szCs w:val="22"/>
+                                    </w:rPr>
+                                    <w:t>Presidente Fundadora – DABIANE LUZ CLEMENTE</w:t>
+                                  </w:r>
+                                </w:p>
+                                <w:p>
+                                  <w:pPr>
+                                    <w:pStyle w:val="FrameContents"/>
+                                    <w:rPr/>
+                                  </w:pPr>
+                                  <w:r>
+                                    <w:rPr/>
+                                  </w:r>
+                                </w:p>
+                              </w:txbxContent>
+                            </wps:txbx>
+                            <wps:bodyPr anchor="t" lIns="91440" tIns="45720" rIns="91440" bIns="45720">
+                              <a:noAutofit/>
+                            </wps:bodyPr>
+                          </wps:wsp>
+                        </a:graphicData>
+                      </a:graphic>
+                    </wp:anchor>
+                  </w:drawing>
+                </mc:Choice>
+                <mc:Fallback>
+                  <w:pict>
+                    <v:rect fillcolor="#FFFFFF" strokecolor="#FFFFFF" strokeweight="0pt" style="position:absolute;rotation:-0;width:294pt;height:145.1pt;mso-wrap-distance-left:9pt;mso-wrap-distance-right:9pt;mso-wrap-distance-top:0pt;mso-wrap-distance-bottom:0pt;margin-top:3.7pt;mso-position-vertical-relative:text;margin-left:157.2pt;mso-position-horizontal-relative:text">
+                      <v:textbox>
+                        <w:txbxContent>
+                          <w:p>
+                            <w:pPr>
+                              <w:pStyle w:val="FrameContents"/>
+                              <w:jc w:val="center"/>
+                              <w:rPr/>
+                            </w:pPr>
+                            <w:r>
+                              <w:rPr>
+                                <w:b/>
+                                <w:sz w:val="20"/>
+                              </w:rPr>
+                              <w:t>COLÔNIA DOS PESCADORES PROFISSIONAIS DE</w:t>
+                            </w:r>
+                          </w:p>
+                          <w:p>
+                            <w:pPr>
+                              <w:pStyle w:val="FrameContents"/>
+                              <w:jc w:val="center"/>
+                              <w:rPr>
+                                <w:b/>
+                                <w:sz w:val="20"/>
+                              </w:rPr>
+                            </w:pPr>
+                            <w:r>
+                              <w:rPr>
+                                <w:b/>
+                                <w:sz w:val="20"/>
+                              </w:rPr>
+                              <w:t>FRUTAL E REGIÃO Z -18</w:t>
+                            </w:r>
+                          </w:p>
+                          <w:p>
+                            <w:pPr>
+                              <w:pStyle w:val="FrameContents"/>
+                              <w:jc w:val="center"/>
+                              <w:rPr>
+                                <w:b/>
+                                <w:sz w:val="22"/>
+                                <w:szCs w:val="22"/>
+                              </w:rPr>
+                            </w:pPr>
+                            <w:r>
+                              <w:rPr>
+                                <w:b/>
+                                <w:sz w:val="22"/>
+                                <w:szCs w:val="22"/>
+                              </w:rPr>
+                              <w:t>R: São Franc. De Sales, N.º1048 – Progresso</w:t>
+                            </w:r>
+                          </w:p>
+                          <w:p>
+                            <w:pPr>
+                              <w:pStyle w:val="FrameContents"/>
+                              <w:jc w:val="center"/>
+                              <w:rPr>
+                                <w:sz w:val="20"/>
+                              </w:rPr>
+                            </w:pPr>
+                            <w:r>
+                              <w:rPr>
+                                <w:b/>
+                                <w:sz w:val="20"/>
+                              </w:rPr>
+                              <w:t>CEP: 38.200 – 000</w:t>
+                            </w:r>
+                          </w:p>
+                          <w:p>
+                            <w:pPr>
+                              <w:pStyle w:val="FrameContents"/>
+                              <w:tabs>
+                                <w:tab w:val="clear" w:pos="708"/>
+                                <w:tab w:val="left" w:pos="1263" w:leader="none"/>
+                                <w:tab w:val="center" w:pos="4472" w:leader="none"/>
+                              </w:tabs>
+                              <w:jc w:val="center"/>
+                              <w:rPr>
+                                <w:sz w:val="22"/>
+                                <w:szCs w:val="22"/>
+                              </w:rPr>
+                            </w:pPr>
+                            <w:r>
+                              <w:rPr>
+                                <w:rFonts w:cs="Monotype Corsiva" w:ascii="Monotype Corsiva" w:hAnsi="Monotype Corsiva"/>
+                                <w:b/>
+                                <w:i/>
+                                <w:sz w:val="22"/>
+                                <w:szCs w:val="22"/>
+                              </w:rPr>
+                              <w:t>Tel./ (0xx34) 3423-6691</w:t>
+                            </w:r>
+                          </w:p>
+                          <w:p>
+                            <w:pPr>
+                              <w:pStyle w:val="FrameContents"/>
+                              <w:tabs>
+                                <w:tab w:val="clear" w:pos="708"/>
+                                <w:tab w:val="left" w:pos="1263" w:leader="none"/>
+                                <w:tab w:val="center" w:pos="4472" w:leader="none"/>
+                              </w:tabs>
+                              <w:jc w:val="center"/>
+                              <w:rPr>
+                                <w:sz w:val="20"/>
+                              </w:rPr>
+                            </w:pPr>
+                            <w:r>
+                              <w:rPr>
+                                <w:rFonts w:cs="Monotype Corsiva" w:ascii="Monotype Corsiva" w:hAnsi="Monotype Corsiva"/>
+                                <w:b/>
+                                <w:i/>
+                                <w:sz w:val="20"/>
+                              </w:rPr>
+                              <w:t>CNPJ  nº. 07.500.616/0001-70</w:t>
+                            </w:r>
+                          </w:p>
+                          <w:p>
+                            <w:pPr>
+                              <w:pStyle w:val="FrameContents"/>
+                              <w:jc w:val="center"/>
+                              <w:rPr>
+                                <w:rFonts w:ascii="Monotype Corsiva" w:hAnsi="Monotype Corsiva" w:cs="Monotype Corsiva"/>
+                                <w:b/>
+                                <w:i/>
+                                <w:i/>
+                                <w:sz w:val="22"/>
+                                <w:szCs w:val="22"/>
+                              </w:rPr>
+                            </w:pPr>
+                            <w:r>
+                              <w:rPr>
+                                <w:rFonts w:cs="Monotype Corsiva" w:ascii="Monotype Corsiva" w:hAnsi="Monotype Corsiva"/>
+                                <w:b/>
+                                <w:i/>
+                                <w:sz w:val="22"/>
+                                <w:szCs w:val="22"/>
+                              </w:rPr>
+                              <w:t>Presidente Fundadora – DABIANE LUZ CLEMENTE</w:t>
+                            </w:r>
+                          </w:p>
+                          <w:p>
+                            <w:pPr>
+                              <w:pStyle w:val="FrameContents"/>
+                              <w:rPr/>
+                            </w:pPr>
+                            <w:r>
+                              <w:rPr/>
+                            </w:r>
+                          </w:p>
+                        </w:txbxContent>
+                      </v:textbox>
+                      <w10:wrap type="none"/>
+                    </v:rect>
+                  </w:pict>
+                </mc:Fallback>
+              </mc:AlternateContent>
             </w:r>
           </w:p>
         </w:tc>
       </w:tr>
       <w:tr>
+        <w:trPr/>
         <w:tc>
           <w:tcPr>
-            <w:tcW w:w="4604" w:type="dxa"/>
+            <w:tcW w:w="4603" w:type="dxa"/>
             <w:tcBorders>
               <w:top w:val="single" w:sz="4" w:space="0" w:color="000000"/>
               <w:left w:val="single" w:sz="4" w:space="0" w:color="000000"/>
@@ -279,14 +458,14 @@
           </w:tcPr>
           <w:p>
             <w:pPr>
-              <w:pStyle w:val="Cabealho"/>
+              <w:pStyle w:val="Header"/>
               <w:tabs>
                 <w:tab w:val="clear" w:pos="4419"/>
                 <w:tab w:val="clear" w:pos="8838"/>
-                <w:tab w:val="center" w:pos="4779"/>
-                <w:tab w:val="right" w:pos="9198"/>
+                <w:tab w:val="center" w:pos="4779" w:leader="none"/>
+                <w:tab w:val="right" w:pos="9198" w:leader="none"/>
               </w:tabs>
-              <w:spacing w:before="20" w:after="20" w:line="240" w:lineRule="auto"/>
+              <w:spacing w:lineRule="auto" w:line="240" w:before="20" w:after="20"/>
               <w:jc w:val="center"/>
               <w:rPr>
                 <w:b/>
@@ -295,17 +474,25 @@
                 <w:szCs w:val="28"/>
               </w:rPr>
             </w:pPr>
+            <w:r>
+              <w:rPr>
+                <w:b/>
+                <w:bCs/>
+                <w:sz w:val="28"/>
+                <w:szCs w:val="28"/>
+              </w:rPr>
+            </w:r>
           </w:p>
           <w:p>
             <w:pPr>
-              <w:pStyle w:val="Cabealho"/>
+              <w:pStyle w:val="Header"/>
               <w:tabs>
                 <w:tab w:val="clear" w:pos="4419"/>
                 <w:tab w:val="clear" w:pos="8838"/>
-                <w:tab w:val="center" w:pos="4779"/>
-                <w:tab w:val="right" w:pos="9198"/>
+                <w:tab w:val="center" w:pos="4779" w:leader="none"/>
+                <w:tab w:val="right" w:pos="9198" w:leader="none"/>
               </w:tabs>
-              <w:spacing w:before="20" w:after="20" w:line="240" w:lineRule="auto"/>
+              <w:spacing w:lineRule="auto" w:line="240" w:before="20" w:after="20"/>
               <w:jc w:val="center"/>
               <w:rPr>
                 <w:b/>
@@ -326,25 +513,31 @@
           </w:p>
           <w:p>
             <w:pPr>
-              <w:pStyle w:val="Cabealho"/>
+              <w:pStyle w:val="Header"/>
               <w:tabs>
                 <w:tab w:val="clear" w:pos="4419"/>
                 <w:tab w:val="clear" w:pos="8838"/>
-                <w:tab w:val="center" w:pos="4779"/>
-                <w:tab w:val="right" w:pos="9198"/>
+                <w:tab w:val="center" w:pos="4779" w:leader="none"/>
+                <w:tab w:val="right" w:pos="9198" w:leader="none"/>
               </w:tabs>
-              <w:spacing w:before="20" w:after="20" w:line="240" w:lineRule="auto"/>
+              <w:spacing w:lineRule="auto" w:line="240" w:before="20" w:after="20"/>
               <w:jc w:val="center"/>
               <w:rPr>
                 <w:b/>
                 <w:bCs/>
               </w:rPr>
             </w:pPr>
+            <w:r>
+              <w:rPr>
+                <w:b/>
+                <w:bCs/>
+              </w:rPr>
+            </w:r>
           </w:p>
         </w:tc>
         <w:tc>
           <w:tcPr>
-            <w:tcW w:w="4625" w:type="dxa"/>
+            <w:tcW w:w="4626" w:type="dxa"/>
             <w:tcBorders>
               <w:top w:val="single" w:sz="4" w:space="0" w:color="000000"/>
               <w:left w:val="single" w:sz="4" w:space="0" w:color="000000"/>
@@ -354,31 +547,37 @@
           </w:tcPr>
           <w:p>
             <w:pPr>
-              <w:pStyle w:val="Cabealho"/>
+              <w:pStyle w:val="Header"/>
               <w:tabs>
                 <w:tab w:val="clear" w:pos="4419"/>
                 <w:tab w:val="clear" w:pos="8838"/>
-                <w:tab w:val="center" w:pos="4779"/>
-                <w:tab w:val="right" w:pos="9198"/>
+                <w:tab w:val="center" w:pos="4779" w:leader="none"/>
+                <w:tab w:val="right" w:pos="9198" w:leader="none"/>
               </w:tabs>
-              <w:spacing w:before="20" w:after="20" w:line="240" w:lineRule="auto"/>
+              <w:spacing w:lineRule="auto" w:line="240" w:before="20" w:after="20"/>
               <w:jc w:val="center"/>
               <w:rPr>
                 <w:b/>
                 <w:bCs/>
               </w:rPr>
             </w:pPr>
+            <w:r>
+              <w:rPr>
+                <w:b/>
+                <w:bCs/>
+              </w:rPr>
+            </w:r>
           </w:p>
           <w:p>
             <w:pPr>
-              <w:pStyle w:val="Cabealho"/>
+              <w:pStyle w:val="Header"/>
               <w:tabs>
                 <w:tab w:val="clear" w:pos="4419"/>
                 <w:tab w:val="clear" w:pos="8838"/>
-                <w:tab w:val="center" w:pos="4779"/>
-                <w:tab w:val="right" w:pos="9198"/>
+                <w:tab w:val="center" w:pos="4779" w:leader="none"/>
+                <w:tab w:val="right" w:pos="9198" w:leader="none"/>
               </w:tabs>
-              <w:spacing w:before="20" w:after="20" w:line="240" w:lineRule="auto"/>
+              <w:spacing w:lineRule="auto" w:line="240" w:before="20" w:after="20"/>
               <w:jc w:val="center"/>
               <w:rPr>
                 <w:bCs/>
@@ -390,26 +589,13 @@
                 <w:b/>
                 <w:bCs/>
               </w:rPr>
-              <w:t xml:space="preserve">R$ </w:t>
-            </w:r>
-            <w:r>
-              <w:rPr>
-                <w:b/>
-                <w:bCs/>
-              </w:rPr>
-              <w:t>48</w:t>
-            </w:r>
-            <w:r>
-              <w:rPr>
-                <w:b/>
-                <w:bCs/>
-              </w:rPr>
-              <w:t>0,00</w:t>
+              <w:t>R$ 480,00</w:t>
             </w:r>
           </w:p>
         </w:tc>
       </w:tr>
       <w:tr>
+        <w:trPr/>
         <w:tc>
           <w:tcPr>
             <w:tcW w:w="9229" w:type="dxa"/>
@@ -422,30 +608,35 @@
           </w:tcPr>
           <w:p>
             <w:pPr>
-              <w:pStyle w:val="Cabealho"/>
+              <w:pStyle w:val="Header"/>
               <w:tabs>
                 <w:tab w:val="clear" w:pos="4419"/>
                 <w:tab w:val="clear" w:pos="8838"/>
-                <w:tab w:val="center" w:pos="4779"/>
-                <w:tab w:val="right" w:pos="9198"/>
+                <w:tab w:val="center" w:pos="4779" w:leader="none"/>
+                <w:tab w:val="right" w:pos="9198" w:leader="none"/>
               </w:tabs>
-              <w:snapToGrid w:val="0"/>
-              <w:spacing w:before="20" w:after="20" w:line="240" w:lineRule="auto"/>
+              <w:snapToGrid w:val="false"/>
+              <w:spacing w:lineRule="auto" w:line="240" w:before="20" w:after="20"/>
               <w:rPr>
                 <w:bCs/>
               </w:rPr>
             </w:pPr>
+            <w:r>
+              <w:rPr>
+                <w:bCs/>
+              </w:rPr>
+            </w:r>
           </w:p>
           <w:p>
             <w:pPr>
-              <w:pStyle w:val="Cabealho"/>
+              <w:pStyle w:val="Header"/>
               <w:tabs>
                 <w:tab w:val="clear" w:pos="4419"/>
                 <w:tab w:val="clear" w:pos="8838"/>
-                <w:tab w:val="center" w:pos="4779"/>
-                <w:tab w:val="right" w:pos="9198"/>
+                <w:tab w:val="center" w:pos="4779" w:leader="none"/>
+                <w:tab w:val="right" w:pos="9198" w:leader="none"/>
               </w:tabs>
-              <w:spacing w:before="20" w:after="20" w:line="240" w:lineRule="auto"/>
+              <w:spacing w:lineRule="auto" w:line="240" w:before="20" w:after="20"/>
               <w:rPr>
                 <w:bCs/>
               </w:rPr>
@@ -455,49 +646,7 @@
                 <w:bCs/>
                 <w:u w:val="single"/>
               </w:rPr>
-              <w:t>${</w:t>
-            </w:r>
-            <w:r>
-              <w:rPr>
-                <w:bCs/>
-                <w:u w:val="single"/>
-              </w:rPr>
-              <w:t>CITY</w:t>
-            </w:r>
-            <w:r>
-              <w:rPr>
-                <w:bCs/>
-                <w:u w:val="single"/>
-              </w:rPr>
-              <w:t>},</w:t>
-            </w:r>
-            <w:r>
-              <w:rPr>
-                <w:bCs/>
-                <w:u w:val="single"/>
-              </w:rPr>
-              <w:t xml:space="preserve"> </w:t>
-            </w:r>
-            <w:r>
-              <w:rPr>
-                <w:bCs/>
-                <w:u w:val="single"/>
-              </w:rPr>
-              <w:t>${</w:t>
-            </w:r>
-            <w:r>
-              <w:rPr>
-                <w:bCs/>
-                <w:u w:val="single"/>
-              </w:rPr>
-              <w:t>PAYMENT_DATE</w:t>
-            </w:r>
-            <w:r>
-              <w:rPr>
-                <w:bCs/>
-                <w:u w:val="single"/>
-              </w:rPr>
-              <w:t>}</w:t>
+              <w:t>${CITY}, ${PAYMENT_DATE}</w:t>
             </w:r>
             <w:r>
               <w:rPr>
@@ -508,29 +657,34 @@
           </w:p>
           <w:p>
             <w:pPr>
-              <w:pStyle w:val="Cabealho"/>
+              <w:pStyle w:val="Header"/>
               <w:tabs>
                 <w:tab w:val="clear" w:pos="4419"/>
                 <w:tab w:val="clear" w:pos="8838"/>
-                <w:tab w:val="center" w:pos="4779"/>
-                <w:tab w:val="right" w:pos="9198"/>
+                <w:tab w:val="center" w:pos="4779" w:leader="none"/>
+                <w:tab w:val="right" w:pos="9198" w:leader="none"/>
               </w:tabs>
-              <w:spacing w:before="20" w:after="20" w:line="240" w:lineRule="auto"/>
+              <w:spacing w:lineRule="auto" w:line="240" w:before="20" w:after="20"/>
               <w:rPr>
                 <w:bCs/>
               </w:rPr>
             </w:pPr>
+            <w:r>
+              <w:rPr>
+                <w:bCs/>
+              </w:rPr>
+            </w:r>
           </w:p>
           <w:p>
             <w:pPr>
-              <w:pStyle w:val="Cabealho"/>
+              <w:pStyle w:val="Header"/>
               <w:tabs>
                 <w:tab w:val="clear" w:pos="4419"/>
                 <w:tab w:val="clear" w:pos="8838"/>
-                <w:tab w:val="center" w:pos="4779"/>
-                <w:tab w:val="right" w:pos="9198"/>
+                <w:tab w:val="center" w:pos="4779" w:leader="none"/>
+                <w:tab w:val="right" w:pos="9198" w:leader="none"/>
               </w:tabs>
-              <w:spacing w:before="20" w:after="20" w:line="240" w:lineRule="auto"/>
+              <w:spacing w:lineRule="auto" w:line="240" w:before="20" w:after="20"/>
               <w:rPr>
                 <w:bCs/>
               </w:rPr>
@@ -546,26 +700,13 @@
                 <w:bCs/>
                 <w:u w:val="single"/>
               </w:rPr>
-              <w:t>${</w:t>
-            </w:r>
-            <w:r>
-              <w:rPr>
-                <w:bCs/>
-                <w:u w:val="single"/>
-              </w:rPr>
-              <w:t>NAME</w:t>
-            </w:r>
-            <w:r>
-              <w:rPr>
-                <w:bCs/>
-                <w:u w:val="single"/>
-              </w:rPr>
-              <w:t>}</w:t>
+              <w:t>${NAME}</w:t>
             </w:r>
           </w:p>
         </w:tc>
       </w:tr>
       <w:tr>
+        <w:trPr/>
         <w:tc>
           <w:tcPr>
             <w:tcW w:w="9229" w:type="dxa"/>
@@ -577,14 +718,14 @@
           </w:tcPr>
           <w:p>
             <w:pPr>
-              <w:pStyle w:val="Cabealho"/>
+              <w:pStyle w:val="Header"/>
               <w:tabs>
                 <w:tab w:val="clear" w:pos="4419"/>
                 <w:tab w:val="clear" w:pos="8838"/>
-                <w:tab w:val="center" w:pos="4779"/>
-                <w:tab w:val="right" w:pos="9198"/>
+                <w:tab w:val="center" w:pos="4779" w:leader="none"/>
+                <w:tab w:val="right" w:pos="9198" w:leader="none"/>
               </w:tabs>
-              <w:spacing w:before="20" w:after="20" w:line="240" w:lineRule="auto"/>
+              <w:spacing w:lineRule="auto" w:line="240" w:before="20" w:after="20"/>
               <w:rPr>
                 <w:bCs/>
               </w:rPr>
@@ -600,19 +741,13 @@
                 <w:bCs/>
                 <w:u w:val="single"/>
               </w:rPr>
-              <w:t>quatrocentos e oitenta</w:t>
-            </w:r>
-            <w:r>
-              <w:rPr>
-                <w:bCs/>
-                <w:u w:val="single"/>
-              </w:rPr>
-              <w:t xml:space="preserve"> reais</w:t>
+              <w:t>quatrocentos e oitenta reais</w:t>
             </w:r>
           </w:p>
         </w:tc>
       </w:tr>
       <w:tr>
+        <w:trPr/>
         <w:tc>
           <w:tcPr>
             <w:tcW w:w="9229" w:type="dxa"/>
@@ -624,14 +759,14 @@
           </w:tcPr>
           <w:p>
             <w:pPr>
-              <w:pStyle w:val="Cabealho"/>
+              <w:pStyle w:val="Header"/>
               <w:tabs>
                 <w:tab w:val="clear" w:pos="4419"/>
                 <w:tab w:val="clear" w:pos="8838"/>
-                <w:tab w:val="center" w:pos="4779"/>
-                <w:tab w:val="right" w:pos="9198"/>
+                <w:tab w:val="center" w:pos="4779" w:leader="none"/>
+                <w:tab w:val="right" w:pos="9198" w:leader="none"/>
               </w:tabs>
-              <w:spacing w:before="20" w:after="20" w:line="240" w:lineRule="auto"/>
+              <w:spacing w:lineRule="auto" w:line="240" w:before="20" w:after="20"/>
               <w:rPr>
                 <w:bCs/>
               </w:rPr>
@@ -640,53 +775,30 @@
               <w:rPr>
                 <w:bCs/>
               </w:rPr>
-              <w:t xml:space="preserve">Referente a anuidade dos serviços da Colônia dos Pescadores com vencimento em </w:t>
-            </w:r>
-            <w:r>
-              <w:rPr>
-                <w:bCs/>
-              </w:rPr>
-              <w:t>${</w:t>
-            </w:r>
-            <w:r>
-              <w:rPr>
-                <w:bCs/>
-              </w:rPr>
-              <w:t>VALID_UNTIL</w:t>
-            </w:r>
-            <w:r>
-              <w:rPr>
-                <w:bCs/>
-              </w:rPr>
-              <w:t>}</w:t>
-            </w:r>
-            <w:r>
-              <w:rPr>
-                <w:bCs/>
-              </w:rPr>
-              <w:t>.</w:t>
+              <w:t>Referente a anuidade dos serviços da Colônia dos Pescadores com vencimento em ${VALID_UNTIL}.</w:t>
             </w:r>
           </w:p>
         </w:tc>
       </w:tr>
       <w:tr>
+        <w:trPr/>
         <w:tc>
           <w:tcPr>
-            <w:tcW w:w="4604" w:type="dxa"/>
+            <w:tcW w:w="4603" w:type="dxa"/>
             <w:tcBorders>
               <w:left w:val="single" w:sz="4" w:space="0" w:color="000000"/>
             </w:tcBorders>
           </w:tcPr>
           <w:p>
             <w:pPr>
-              <w:pStyle w:val="Cabealho"/>
+              <w:pStyle w:val="Header"/>
               <w:tabs>
                 <w:tab w:val="clear" w:pos="4419"/>
                 <w:tab w:val="clear" w:pos="8838"/>
-                <w:tab w:val="center" w:pos="4779"/>
-                <w:tab w:val="right" w:pos="9198"/>
+                <w:tab w:val="center" w:pos="4779" w:leader="none"/>
+                <w:tab w:val="right" w:pos="9198" w:leader="none"/>
               </w:tabs>
-              <w:spacing w:before="20" w:after="20" w:line="240" w:lineRule="auto"/>
+              <w:spacing w:lineRule="auto" w:line="240" w:before="20" w:after="20"/>
               <w:rPr>
                 <w:bCs/>
               </w:rPr>
@@ -701,30 +813,38 @@
         </w:tc>
         <w:tc>
           <w:tcPr>
-            <w:tcW w:w="4625" w:type="dxa"/>
+            <w:tcW w:w="4626" w:type="dxa"/>
             <w:tcBorders>
               <w:right w:val="single" w:sz="4" w:space="0" w:color="000000"/>
             </w:tcBorders>
           </w:tcPr>
           <w:p>
             <w:pPr>
-              <w:pStyle w:val="Cabealho"/>
+              <w:pStyle w:val="Header"/>
               <w:tabs>
                 <w:tab w:val="clear" w:pos="4419"/>
                 <w:tab w:val="clear" w:pos="8838"/>
-                <w:tab w:val="center" w:pos="4779"/>
-                <w:tab w:val="right" w:pos="9198"/>
+                <w:tab w:val="center" w:pos="4779" w:leader="none"/>
+                <w:tab w:val="right" w:pos="9198" w:leader="none"/>
               </w:tabs>
-              <w:snapToGrid w:val="0"/>
-              <w:spacing w:before="20" w:after="20" w:line="240" w:lineRule="auto"/>
+              <w:snapToGrid w:val="false"/>
+              <w:spacing w:lineRule="auto" w:line="240" w:before="20" w:after="20"/>
               <w:rPr>
                 <w:bCs/>
               </w:rPr>
             </w:pPr>
+            <w:r>
+              <w:rPr>
+                <w:bCs/>
+              </w:rPr>
+            </w:r>
           </w:p>
         </w:tc>
       </w:tr>
       <w:tr>
+        <w:trPr>
+          <w:trHeight w:val="1844" w:hRule="atLeast"/>
+        </w:trPr>
         <w:tc>
           <w:tcPr>
             <w:tcW w:w="9229" w:type="dxa"/>
@@ -737,46 +857,59 @@
           </w:tcPr>
           <w:p>
             <w:pPr>
-              <w:pStyle w:val="Cabealho"/>
+              <w:pStyle w:val="Header"/>
               <w:tabs>
                 <w:tab w:val="clear" w:pos="4419"/>
                 <w:tab w:val="clear" w:pos="8838"/>
-                <w:tab w:val="center" w:pos="4779"/>
-                <w:tab w:val="right" w:pos="9198"/>
+                <w:tab w:val="center" w:pos="4779" w:leader="none"/>
+                <w:tab w:val="right" w:pos="9198" w:leader="none"/>
               </w:tabs>
-              <w:spacing w:before="20" w:after="20" w:line="240" w:lineRule="auto"/>
+              <w:spacing w:lineRule="auto" w:line="240" w:before="20" w:after="20"/>
               <w:rPr>
                 <w:bCs/>
                 <w:u w:val="single"/>
               </w:rPr>
             </w:pPr>
+            <w:r>
+              <w:rPr>
+                <w:bCs/>
+                <w:u w:val="single"/>
+              </w:rPr>
+            </w:r>
           </w:p>
           <w:p>
             <w:pPr>
-              <w:pStyle w:val="Cabealho"/>
+              <w:pStyle w:val="Header"/>
               <w:tabs>
                 <w:tab w:val="clear" w:pos="4419"/>
                 <w:tab w:val="clear" w:pos="8838"/>
-                <w:tab w:val="center" w:pos="4779"/>
-                <w:tab w:val="right" w:pos="9198"/>
+                <w:tab w:val="center" w:pos="4779" w:leader="none"/>
+                <w:tab w:val="right" w:pos="9198" w:leader="none"/>
               </w:tabs>
-              <w:spacing w:before="20" w:after="20" w:line="240" w:lineRule="auto"/>
+              <w:spacing w:lineRule="auto" w:line="240" w:before="20" w:after="20"/>
               <w:rPr>
                 <w:bCs/>
                 <w:u w:val="single"/>
               </w:rPr>
             </w:pPr>
+            <w:r>
+              <w:rPr>
+                <w:bCs/>
+                <w:u w:val="single"/>
+              </w:rPr>
+            </w:r>
           </w:p>
           <w:p>
             <w:pPr>
-              <w:pStyle w:val="Cabealho"/>
+              <w:pStyle w:val="Header"/>
               <w:tabs>
                 <w:tab w:val="clear" w:pos="4419"/>
                 <w:tab w:val="clear" w:pos="8838"/>
-                <w:tab w:val="center" w:pos="4779"/>
-                <w:tab w:val="right" w:pos="9198"/>
+                <w:tab w:val="center" w:pos="4779" w:leader="none"/>
+                <w:tab w:val="right" w:pos="9198" w:leader="none"/>
               </w:tabs>
-              <w:spacing w:before="20" w:after="20" w:line="240" w:lineRule="auto"/>
+              <w:spacing w:lineRule="auto" w:line="240" w:before="20" w:after="20"/>
+              <w:rPr/>
             </w:pPr>
             <w:r>
               <w:rPr>
@@ -787,108 +920,270 @@
           </w:p>
           <w:p>
             <w:pPr>
-              <w:pStyle w:val="Cabealho"/>
+              <w:pStyle w:val="Header"/>
               <w:tabs>
                 <w:tab w:val="clear" w:pos="4419"/>
                 <w:tab w:val="clear" w:pos="8838"/>
-                <w:tab w:val="center" w:pos="4779"/>
-                <w:tab w:val="right" w:pos="9198"/>
+                <w:tab w:val="center" w:pos="4779" w:leader="none"/>
+                <w:tab w:val="right" w:pos="9198" w:leader="none"/>
               </w:tabs>
-              <w:spacing w:before="20" w:after="20" w:line="240" w:lineRule="auto"/>
+              <w:spacing w:lineRule="auto" w:line="240" w:before="20" w:after="20"/>
+              <w:rPr/>
             </w:pPr>
+            <w:r>
+              <w:rPr/>
+            </w:r>
           </w:p>
         </w:tc>
       </w:tr>
     </w:tbl>
     <w:p>
       <w:pPr>
-        <w:pStyle w:val="Cabealho"/>
+        <w:pStyle w:val="Header"/>
         <w:tabs>
           <w:tab w:val="clear" w:pos="4419"/>
           <w:tab w:val="clear" w:pos="8838"/>
-          <w:tab w:val="center" w:pos="4779"/>
-          <w:tab w:val="right" w:pos="9198"/>
+          <w:tab w:val="center" w:pos="4779" w:leader="none"/>
+          <w:tab w:val="right" w:pos="9198" w:leader="none"/>
         </w:tabs>
-        <w:spacing w:line="240" w:lineRule="auto"/>
-      </w:pPr>
+        <w:spacing w:lineRule="auto" w:line="240"/>
+        <w:rPr/>
+      </w:pPr>
+      <w:r>
+        <w:rPr/>
+      </w:r>
     </w:p>
     <w:p>
       <w:pPr>
-        <w:pStyle w:val="Cabealho"/>
+        <w:pStyle w:val="Header"/>
         <w:tabs>
           <w:tab w:val="clear" w:pos="4419"/>
           <w:tab w:val="clear" w:pos="8838"/>
-          <w:tab w:val="center" w:pos="4779"/>
-          <w:tab w:val="right" w:pos="9198"/>
+          <w:tab w:val="center" w:pos="4779" w:leader="none"/>
+          <w:tab w:val="right" w:pos="9198" w:leader="none"/>
         </w:tabs>
-        <w:spacing w:line="240" w:lineRule="auto"/>
+        <w:spacing w:lineRule="auto" w:line="240"/>
         <w:rPr>
           <w:b/>
           <w:bCs/>
         </w:rPr>
       </w:pPr>
+      <w:r>
+        <w:rPr>
+          <w:b/>
+          <w:bCs/>
+        </w:rPr>
+      </w:r>
     </w:p>
-    <w:p/>
-    <w:p/>
-    <w:p/>
-    <w:p/>
-    <w:p/>
     <w:p>
       <w:pPr>
+        <w:pStyle w:val="Normal"/>
+        <w:rPr/>
+      </w:pPr>
+      <w:r>
+        <w:rPr/>
+      </w:r>
+    </w:p>
+    <w:p>
+      <w:pPr>
+        <w:pStyle w:val="Normal"/>
+        <w:rPr/>
+      </w:pPr>
+      <w:r>
+        <w:rPr/>
+      </w:r>
+    </w:p>
+    <w:p>
+      <w:pPr>
+        <w:pStyle w:val="Normal"/>
+        <w:rPr/>
+      </w:pPr>
+      <w:r>
+        <w:rPr/>
+      </w:r>
+    </w:p>
+    <w:p>
+      <w:pPr>
+        <w:pStyle w:val="Normal"/>
+        <w:rPr/>
+      </w:pPr>
+      <w:r>
+        <w:rPr/>
+      </w:r>
+    </w:p>
+    <w:p>
+      <w:pPr>
+        <w:pStyle w:val="Normal"/>
+        <w:rPr/>
+      </w:pPr>
+      <w:r>
+        <w:rPr/>
+      </w:r>
+    </w:p>
+    <w:p>
+      <w:pPr>
+        <w:pStyle w:val="Normal"/>
         <w:rPr>
+          <w:b/>
+          <w:bCs/>
           <w:u w:val="single"/>
         </w:rPr>
       </w:pPr>
+      <w:r>
+        <w:rPr>
+          <w:b/>
+          <w:bCs/>
+          <w:u w:val="single"/>
+        </w:rPr>
+      </w:r>
     </w:p>
-    <w:p/>
-    <w:p/>
-    <w:p/>
-    <w:p/>
-    <w:p/>
-    <w:p/>
-    <w:p/>
-    <w:p/>
-    <w:p/>
-    <w:p/>
-    <w:p/>
-    <w:p/>
+    <w:p>
+      <w:pPr>
+        <w:pStyle w:val="Normal"/>
+        <w:rPr/>
+      </w:pPr>
+      <w:r>
+        <w:rPr/>
+      </w:r>
+    </w:p>
+    <w:p>
+      <w:pPr>
+        <w:pStyle w:val="Normal"/>
+        <w:rPr/>
+      </w:pPr>
+      <w:r>
+        <w:rPr/>
+      </w:r>
+    </w:p>
+    <w:p>
+      <w:pPr>
+        <w:pStyle w:val="Normal"/>
+        <w:rPr/>
+      </w:pPr>
+      <w:r>
+        <w:rPr/>
+      </w:r>
+    </w:p>
+    <w:p>
+      <w:pPr>
+        <w:pStyle w:val="Normal"/>
+        <w:rPr/>
+      </w:pPr>
+      <w:r>
+        <w:rPr/>
+      </w:r>
+    </w:p>
+    <w:p>
+      <w:pPr>
+        <w:pStyle w:val="Normal"/>
+        <w:rPr/>
+      </w:pPr>
+      <w:r>
+        <w:rPr/>
+      </w:r>
+    </w:p>
+    <w:p>
+      <w:pPr>
+        <w:pStyle w:val="Normal"/>
+        <w:rPr/>
+      </w:pPr>
+      <w:r>
+        <w:rPr/>
+      </w:r>
+    </w:p>
+    <w:p>
+      <w:pPr>
+        <w:pStyle w:val="Normal"/>
+        <w:rPr/>
+      </w:pPr>
+      <w:r>
+        <w:rPr/>
+      </w:r>
+    </w:p>
+    <w:p>
+      <w:pPr>
+        <w:pStyle w:val="Normal"/>
+        <w:rPr/>
+      </w:pPr>
+      <w:r>
+        <w:rPr/>
+      </w:r>
+    </w:p>
+    <w:p>
+      <w:pPr>
+        <w:pStyle w:val="Normal"/>
+        <w:rPr/>
+      </w:pPr>
+      <w:r>
+        <w:rPr/>
+      </w:r>
+    </w:p>
+    <w:p>
+      <w:pPr>
+        <w:pStyle w:val="Normal"/>
+        <w:rPr/>
+      </w:pPr>
+      <w:r>
+        <w:rPr/>
+      </w:r>
+    </w:p>
+    <w:p>
+      <w:pPr>
+        <w:pStyle w:val="Normal"/>
+        <w:rPr/>
+      </w:pPr>
+      <w:r>
+        <w:rPr/>
+      </w:r>
+    </w:p>
+    <w:p>
+      <w:pPr>
+        <w:pStyle w:val="Normal"/>
+        <w:rPr/>
+      </w:pPr>
+      <w:r>
+        <w:rPr/>
+      </w:r>
+    </w:p>
     <w:sectPr>
+      <w:type w:val="nextPage"/>
       <w:pgSz w:w="11906" w:h="16838"/>
-      <w:pgMar w:top="1701" w:right="1134" w:bottom="1701" w:left="1134" w:header="0" w:footer="0" w:gutter="0"/>
-      <w:cols w:space="720"/>
-      <w:formProt w:val="0"/>
-      <w:docGrid w:linePitch="360"/>
+      <w:pgMar w:left="1134" w:right="1134" w:gutter="0" w:header="0" w:top="1701" w:footer="0" w:bottom="1701"/>
+      <w:pgNumType w:fmt="decimal"/>
+      <w:formProt w:val="false"/>
+      <w:textDirection w:val="lrTb"/>
+      <w:docGrid w:type="default" w:linePitch="360" w:charSpace="0"/>
     </w:sectPr>
   </w:body>
 </w:document>
 </file>
 
 <file path=word/styles.xml><?xml version="1.0" encoding="utf-8"?>
-<w:styles xmlns:mc="http://schemas.openxmlformats.org/markup-compatibility/2006" xmlns:r="http://schemas.openxmlformats.org/officeDocument/2006/relationships" xmlns:w="http://schemas.openxmlformats.org/wordprocessingml/2006/main" xmlns:w14="http://schemas.microsoft.com/office/word/2010/wordml" xmlns:w15="http://schemas.microsoft.com/office/word/2012/wordml" xmlns:w16cex="http://schemas.microsoft.com/office/word/2018/wordml/cex" xmlns:w16cid="http://schemas.microsoft.com/office/word/2016/wordml/cid" xmlns:w16="http://schemas.microsoft.com/office/word/2018/wordml" xmlns:w16du="http://schemas.microsoft.com/office/word/2023/wordml/word16du" xmlns:w16sdtdh="http://schemas.microsoft.com/office/word/2020/wordml/sdtdatahash" xmlns:w16sdtfl="http://schemas.microsoft.com/office/word/2024/wordml/sdtformatlock" xmlns:w16se="http://schemas.microsoft.com/office/word/2015/wordml/symex" mc:Ignorable="w14 w15 w16se w16cid w16 w16cex w16sdtdh w16sdtfl w16du">
+<w:styles xmlns:w="http://schemas.openxmlformats.org/wordprocessingml/2006/main" xmlns:w14="http://schemas.microsoft.com/office/word/2010/wordml" xmlns:mc="http://schemas.openxmlformats.org/markup-compatibility/2006" mc:Ignorable="w14">
   <w:docDefaults>
     <w:rPrDefault>
       <w:rPr>
-        <w:rFonts w:ascii="Times New Roman" w:eastAsia="Times New Roman" w:hAnsi="Times New Roman" w:cs="Times New Roman"/>
+        <w:rFonts w:ascii="Times New Roman" w:hAnsi="Times New Roman" w:eastAsia="Times New Roman" w:cs="Times New Roman"/>
         <w:lang w:val="pt-BR" w:eastAsia="pt-BR" w:bidi="ar-SA"/>
       </w:rPr>
     </w:rPrDefault>
     <w:pPrDefault>
       <w:pPr>
-        <w:suppressAutoHyphens/>
+        <w:suppressAutoHyphens w:val="true"/>
       </w:pPr>
     </w:pPrDefault>
   </w:docDefaults>
   <w:latentStyles w:defLockedState="0" w:defUIPriority="99" w:defSemiHidden="0" w:defUnhideWhenUsed="0" w:defQFormat="0" w:count="376">
     <w:lsdException w:name="Normal" w:uiPriority="0" w:qFormat="1"/>
     <w:lsdException w:name="heading 1" w:uiPriority="9" w:qFormat="1"/>
-    <w:lsdException w:name="heading 2" w:semiHidden="1" w:uiPriority="9" w:unhideWhenUsed="1" w:qFormat="1"/>
-    <w:lsdException w:name="heading 3" w:semiHidden="1" w:uiPriority="9" w:unhideWhenUsed="1" w:qFormat="1"/>
-    <w:lsdException w:name="heading 4" w:semiHidden="1" w:uiPriority="9" w:unhideWhenUsed="1" w:qFormat="1"/>
-    <w:lsdException w:name="heading 5" w:semiHidden="1" w:uiPriority="9" w:unhideWhenUsed="1" w:qFormat="1"/>
-    <w:lsdException w:name="heading 6" w:semiHidden="1" w:uiPriority="9" w:unhideWhenUsed="1" w:qFormat="1"/>
-    <w:lsdException w:name="heading 7" w:semiHidden="1" w:uiPriority="9" w:unhideWhenUsed="1" w:qFormat="1"/>
-    <w:lsdException w:name="heading 8" w:semiHidden="1" w:uiPriority="9" w:unhideWhenUsed="1" w:qFormat="1"/>
-    <w:lsdException w:name="heading 9" w:semiHidden="1" w:uiPriority="9" w:unhideWhenUsed="1" w:qFormat="1"/>
+    <w:lsdException w:name="heading 2" w:uiPriority="9" w:semiHidden="1" w:unhideWhenUsed="1" w:qFormat="1"/>
+    <w:lsdException w:name="heading 3" w:uiPriority="9" w:semiHidden="1" w:unhideWhenUsed="1" w:qFormat="1"/>
+    <w:lsdException w:name="heading 4" w:uiPriority="9" w:semiHidden="1" w:unhideWhenUsed="1" w:qFormat="1"/>
+    <w:lsdException w:name="heading 5" w:uiPriority="9" w:semiHidden="1" w:unhideWhenUsed="1" w:qFormat="1"/>
+    <w:lsdException w:name="heading 6" w:uiPriority="9" w:semiHidden="1" w:unhideWhenUsed="1" w:qFormat="1"/>
+    <w:lsdException w:name="heading 7" w:uiPriority="9" w:semiHidden="1" w:unhideWhenUsed="1" w:qFormat="1"/>
+    <w:lsdException w:name="heading 8" w:uiPriority="9" w:semiHidden="1" w:unhideWhenUsed="1" w:qFormat="1"/>
+    <w:lsdException w:name="heading 9" w:uiPriority="9" w:semiHidden="1" w:unhideWhenUsed="1" w:qFormat="1"/>
     <w:lsdException w:name="index 1" w:semiHidden="1" w:unhideWhenUsed="1"/>
     <w:lsdException w:name="index 2" w:semiHidden="1" w:unhideWhenUsed="1"/>
     <w:lsdException w:name="index 3" w:semiHidden="1" w:unhideWhenUsed="1"/>
@@ -898,22 +1193,22 @@
     <w:lsdException w:name="index 7" w:semiHidden="1" w:unhideWhenUsed="1"/>
     <w:lsdException w:name="index 8" w:semiHidden="1" w:unhideWhenUsed="1"/>
     <w:lsdException w:name="index 9" w:semiHidden="1" w:unhideWhenUsed="1"/>
-    <w:lsdException w:name="toc 1" w:semiHidden="1" w:uiPriority="39" w:unhideWhenUsed="1"/>
-    <w:lsdException w:name="toc 2" w:semiHidden="1" w:uiPriority="39" w:unhideWhenUsed="1"/>
-    <w:lsdException w:name="toc 3" w:semiHidden="1" w:uiPriority="39" w:unhideWhenUsed="1"/>
-    <w:lsdException w:name="toc 4" w:semiHidden="1" w:uiPriority="39" w:unhideWhenUsed="1"/>
-    <w:lsdException w:name="toc 5" w:semiHidden="1" w:uiPriority="39" w:unhideWhenUsed="1"/>
-    <w:lsdException w:name="toc 6" w:semiHidden="1" w:uiPriority="39" w:unhideWhenUsed="1"/>
-    <w:lsdException w:name="toc 7" w:semiHidden="1" w:uiPriority="39" w:unhideWhenUsed="1"/>
-    <w:lsdException w:name="toc 8" w:semiHidden="1" w:uiPriority="39" w:unhideWhenUsed="1"/>
-    <w:lsdException w:name="toc 9" w:semiHidden="1" w:uiPriority="39" w:unhideWhenUsed="1"/>
+    <w:lsdException w:name="toc 1" w:uiPriority="39" w:semiHidden="1" w:unhideWhenUsed="1"/>
+    <w:lsdException w:name="toc 2" w:uiPriority="39" w:semiHidden="1" w:unhideWhenUsed="1"/>
+    <w:lsdException w:name="toc 3" w:uiPriority="39" w:semiHidden="1" w:unhideWhenUsed="1"/>
+    <w:lsdException w:name="toc 4" w:uiPriority="39" w:semiHidden="1" w:unhideWhenUsed="1"/>
+    <w:lsdException w:name="toc 5" w:uiPriority="39" w:semiHidden="1" w:unhideWhenUsed="1"/>
+    <w:lsdException w:name="toc 6" w:uiPriority="39" w:semiHidden="1" w:unhideWhenUsed="1"/>
+    <w:lsdException w:name="toc 7" w:uiPriority="39" w:semiHidden="1" w:unhideWhenUsed="1"/>
+    <w:lsdException w:name="toc 8" w:uiPriority="39" w:semiHidden="1" w:unhideWhenUsed="1"/>
+    <w:lsdException w:name="toc 9" w:uiPriority="39" w:semiHidden="1" w:unhideWhenUsed="1"/>
     <w:lsdException w:name="Normal Indent" w:semiHidden="1" w:unhideWhenUsed="1"/>
     <w:lsdException w:name="footnote text" w:semiHidden="1" w:unhideWhenUsed="1"/>
     <w:lsdException w:name="annotation text" w:semiHidden="1" w:unhideWhenUsed="1"/>
     <w:lsdException w:name="header" w:semiHidden="1" w:unhideWhenUsed="1"/>
     <w:lsdException w:name="footer" w:semiHidden="1" w:unhideWhenUsed="1"/>
     <w:lsdException w:name="index heading" w:semiHidden="1" w:unhideWhenUsed="1"/>
-    <w:lsdException w:name="caption" w:semiHidden="1" w:uiPriority="35" w:unhideWhenUsed="1" w:qFormat="1"/>
+    <w:lsdException w:name="caption" w:uiPriority="35" w:semiHidden="1" w:unhideWhenUsed="1" w:qFormat="1"/>
     <w:lsdException w:name="table of figures" w:semiHidden="1" w:unhideWhenUsed="1"/>
     <w:lsdException w:name="envelope address" w:semiHidden="1" w:unhideWhenUsed="1"/>
     <w:lsdException w:name="envelope return" w:semiHidden="1" w:unhideWhenUsed="1"/>
@@ -944,7 +1239,7 @@
     <w:lsdException w:name="Title" w:uiPriority="10" w:qFormat="1"/>
     <w:lsdException w:name="Closing" w:semiHidden="1" w:unhideWhenUsed="1"/>
     <w:lsdException w:name="Signature" w:semiHidden="1" w:unhideWhenUsed="1"/>
-    <w:lsdException w:name="Default Paragraph Font" w:semiHidden="1" w:uiPriority="1" w:unhideWhenUsed="1"/>
+    <w:lsdException w:name="Default Paragraph Font" w:uiPriority="1" w:semiHidden="1" w:unhideWhenUsed="1"/>
     <w:lsdException w:name="Body Text" w:semiHidden="1" w:unhideWhenUsed="1"/>
     <w:lsdException w:name="Body Text Indent" w:semiHidden="1" w:unhideWhenUsed="1"/>
     <w:lsdException w:name="List Continue" w:semiHidden="1" w:unhideWhenUsed="1"/>
@@ -1144,8 +1439,8 @@
     <w:lsdException w:name="Subtle Reference" w:uiPriority="31" w:qFormat="1"/>
     <w:lsdException w:name="Intense Reference" w:uiPriority="32" w:qFormat="1"/>
     <w:lsdException w:name="Book Title" w:uiPriority="33" w:qFormat="1"/>
-    <w:lsdException w:name="Bibliography" w:semiHidden="1" w:uiPriority="37" w:unhideWhenUsed="1"/>
-    <w:lsdException w:name="TOC Heading" w:semiHidden="1" w:uiPriority="39" w:unhideWhenUsed="1" w:qFormat="1"/>
+    <w:lsdException w:name="Bibliography" w:uiPriority="37" w:semiHidden="1" w:unhideWhenUsed="1"/>
+    <w:lsdException w:name="TOC Heading" w:uiPriority="39" w:semiHidden="1" w:unhideWhenUsed="1" w:qFormat="1"/>
     <w:lsdException w:name="Plain Table 1" w:uiPriority="41"/>
     <w:lsdException w:name="Plain Table 2" w:uiPriority="42"/>
     <w:lsdException w:name="Plain Table 3" w:uiPriority="43"/>
@@ -1256,54 +1551,42 @@
     <w:lsdException w:name="Unresolved Mention" w:semiHidden="1" w:unhideWhenUsed="1"/>
     <w:lsdException w:name="Smart Link" w:semiHidden="1" w:unhideWhenUsed="1"/>
   </w:latentStyles>
-  <w:style w:type="paragraph" w:default="1" w:styleId="Normal">
+  <w:style w:type="paragraph" w:styleId="Normal" w:default="1">
     <w:name w:val="Normal"/>
     <w:qFormat/>
-    <w:rsid w:val="00163E20"/>
+    <w:rsid w:val="00163e20"/>
     <w:pPr>
-      <w:spacing w:line="360" w:lineRule="auto"/>
+      <w:widowControl/>
+      <w:suppressAutoHyphens w:val="true"/>
+      <w:bidi w:val="0"/>
+      <w:spacing w:lineRule="auto" w:line="360" w:before="0" w:after="0"/>
       <w:jc w:val="both"/>
     </w:pPr>
     <w:rPr>
+      <w:rFonts w:ascii="Times New Roman" w:hAnsi="Times New Roman" w:eastAsia="Times New Roman" w:cs="Times New Roman"/>
+      <w:color w:val="auto"/>
+      <w:kern w:val="0"/>
       <w:sz w:val="24"/>
-      <w:lang w:eastAsia="zh-CN"/>
+      <w:szCs w:val="20"/>
+      <w:lang w:eastAsia="zh-CN" w:val="pt-BR" w:bidi="ar-SA"/>
     </w:rPr>
   </w:style>
-  <w:style w:type="character" w:default="1" w:styleId="Fontepargpadro">
+  <w:style w:type="character" w:styleId="DefaultParagraphFont" w:default="1">
     <w:name w:val="Default Paragraph Font"/>
     <w:uiPriority w:val="1"/>
     <w:semiHidden/>
     <w:unhideWhenUsed/>
+    <w:qFormat/>
+    <w:rPr/>
   </w:style>
-  <w:style w:type="table" w:default="1" w:styleId="Tabelanormal">
-    <w:name w:val="Normal Table"/>
-    <w:uiPriority w:val="99"/>
-    <w:semiHidden/>
-    <w:unhideWhenUsed/>
-    <w:tblPr>
-      <w:tblInd w:w="0" w:type="dxa"/>
-      <w:tblCellMar>
-        <w:top w:w="0" w:type="dxa"/>
-        <w:left w:w="108" w:type="dxa"/>
-        <w:bottom w:w="0" w:type="dxa"/>
-        <w:right w:w="108" w:type="dxa"/>
-      </w:tblCellMar>
-    </w:tblPr>
-  </w:style>
-  <w:style w:type="numbering" w:default="1" w:styleId="Semlista">
-    <w:name w:val="No List"/>
-    <w:uiPriority w:val="99"/>
-    <w:semiHidden/>
-    <w:unhideWhenUsed/>
-  </w:style>
-  <w:style w:type="character" w:customStyle="1" w:styleId="TextodebaloChar">
+  <w:style w:type="character" w:styleId="TextodebaloChar" w:customStyle="1">
     <w:name w:val="Texto de balão Char"/>
-    <w:basedOn w:val="Fontepargpadro"/>
-    <w:link w:val="Textodebalo"/>
+    <w:basedOn w:val="DefaultParagraphFont"/>
+    <w:link w:val="BalloonText"/>
     <w:uiPriority w:val="99"/>
     <w:semiHidden/>
     <w:qFormat/>
-    <w:rsid w:val="00961E35"/>
+    <w:rsid w:val="00961e35"/>
     <w:rPr>
       <w:rFonts w:ascii="Tahoma" w:hAnsi="Tahoma" w:cs="Tahoma"/>
       <w:sz w:val="16"/>
@@ -1311,37 +1594,39 @@
       <w:lang w:eastAsia="zh-CN"/>
     </w:rPr>
   </w:style>
-  <w:style w:type="paragraph" w:customStyle="1" w:styleId="Heading">
-    <w:name w:val="Heading"/>
+  <w:style w:type="paragraph" w:styleId="Ttulo" w:customStyle="1">
+    <w:name w:val="Título"/>
     <w:basedOn w:val="Normal"/>
-    <w:next w:val="Corpodetexto"/>
+    <w:next w:val="BodyText"/>
     <w:qFormat/>
     <w:pPr>
-      <w:keepNext/>
+      <w:keepNext w:val="true"/>
       <w:spacing w:before="240" w:after="120"/>
     </w:pPr>
     <w:rPr>
-      <w:rFonts w:ascii="Liberation Sans" w:eastAsia="Noto Sans CJK SC" w:hAnsi="Liberation Sans" w:cs="Lohit Devanagari"/>
+      <w:rFonts w:ascii="Liberation Sans" w:hAnsi="Liberation Sans" w:eastAsia="Noto Sans CJK SC" w:cs="Lohit Devanagari"/>
       <w:sz w:val="28"/>
       <w:szCs w:val="28"/>
     </w:rPr>
   </w:style>
-  <w:style w:type="paragraph" w:styleId="Corpodetexto">
+  <w:style w:type="paragraph" w:styleId="BodyText">
     <w:name w:val="Body Text"/>
     <w:basedOn w:val="Normal"/>
     <w:pPr>
-      <w:spacing w:after="140" w:line="276" w:lineRule="auto"/>
+      <w:spacing w:lineRule="auto" w:line="276" w:before="0" w:after="140"/>
     </w:pPr>
+    <w:rPr/>
   </w:style>
-  <w:style w:type="paragraph" w:styleId="Lista">
+  <w:style w:type="paragraph" w:styleId="List">
     <w:name w:val="List"/>
-    <w:basedOn w:val="Corpodetexto"/>
+    <w:basedOn w:val="BodyText"/>
+    <w:pPr/>
     <w:rPr>
       <w:rFonts w:cs="Lohit Devanagari"/>
     </w:rPr>
   </w:style>
-  <w:style w:type="paragraph" w:styleId="Legenda">
-    <w:name w:val="caption"/>
+  <w:style w:type="paragraph" w:styleId="Caption">
+    <w:name w:val="Caption"/>
     <w:basedOn w:val="Normal"/>
     <w:qFormat/>
     <w:pPr>
@@ -1355,8 +1640,8 @@
       <w:szCs w:val="24"/>
     </w:rPr>
   </w:style>
-  <w:style w:type="paragraph" w:customStyle="1" w:styleId="Index">
-    <w:name w:val="Index"/>
+  <w:style w:type="paragraph" w:styleId="ndice" w:customStyle="1">
+    <w:name w:val="Índice"/>
     <w:basedOn w:val="Normal"/>
     <w:qFormat/>
     <w:pPr>
@@ -1366,41 +1651,47 @@
       <w:rFonts w:cs="Lohit Devanagari"/>
     </w:rPr>
   </w:style>
-  <w:style w:type="paragraph" w:customStyle="1" w:styleId="HeaderandFooter">
-    <w:name w:val="Header and Footer"/>
+  <w:style w:type="paragraph" w:styleId="Cabealhoerodap" w:customStyle="1">
+    <w:name w:val="Cabeçalho e rodapé"/>
     <w:basedOn w:val="Normal"/>
     <w:qFormat/>
+    <w:pPr/>
+    <w:rPr/>
   </w:style>
-  <w:style w:type="paragraph" w:styleId="Cabealho">
-    <w:name w:val="header"/>
+  <w:style w:type="paragraph" w:styleId="Header">
+    <w:name w:val="Header"/>
     <w:basedOn w:val="Normal"/>
-    <w:rsid w:val="00C10950"/>
+    <w:rsid w:val="00c10950"/>
     <w:pPr>
       <w:tabs>
-        <w:tab w:val="center" w:pos="4419"/>
-        <w:tab w:val="right" w:pos="8838"/>
+        <w:tab w:val="clear" w:pos="708"/>
+        <w:tab w:val="center" w:pos="4419" w:leader="none"/>
+        <w:tab w:val="right" w:pos="8838" w:leader="none"/>
       </w:tabs>
     </w:pPr>
+    <w:rPr/>
   </w:style>
-  <w:style w:type="paragraph" w:styleId="Rodap">
-    <w:name w:val="footer"/>
+  <w:style w:type="paragraph" w:styleId="Footer">
+    <w:name w:val="Footer"/>
     <w:basedOn w:val="Normal"/>
-    <w:rsid w:val="00C10950"/>
+    <w:rsid w:val="00c10950"/>
     <w:pPr>
       <w:tabs>
-        <w:tab w:val="center" w:pos="4419"/>
-        <w:tab w:val="right" w:pos="8838"/>
+        <w:tab w:val="clear" w:pos="708"/>
+        <w:tab w:val="center" w:pos="4419" w:leader="none"/>
+        <w:tab w:val="right" w:pos="8838" w:leader="none"/>
       </w:tabs>
     </w:pPr>
+    <w:rPr/>
   </w:style>
-  <w:style w:type="paragraph" w:customStyle="1" w:styleId="Contedodoquadro">
+  <w:style w:type="paragraph" w:styleId="Contedodoquadro" w:customStyle="1">
     <w:name w:val="Conteúdo do quadro"/>
     <w:basedOn w:val="Normal"/>
     <w:qFormat/>
-    <w:rsid w:val="00961E35"/>
+    <w:rsid w:val="00961e35"/>
     <w:pPr>
-      <w:suppressAutoHyphens w:val="0"/>
-      <w:spacing w:line="240" w:lineRule="auto"/>
+      <w:suppressAutoHyphens w:val="false"/>
+      <w:spacing w:lineRule="auto" w:line="240"/>
       <w:jc w:val="left"/>
     </w:pPr>
     <w:rPr>
@@ -1408,7 +1699,7 @@
       <w:szCs w:val="24"/>
     </w:rPr>
   </w:style>
-  <w:style w:type="paragraph" w:styleId="Textodebalo">
+  <w:style w:type="paragraph" w:styleId="BalloonText">
     <w:name w:val="Balloon Text"/>
     <w:basedOn w:val="Normal"/>
     <w:link w:val="TextodebaloChar"/>
@@ -1416,9 +1707,9 @@
     <w:semiHidden/>
     <w:unhideWhenUsed/>
     <w:qFormat/>
-    <w:rsid w:val="00961E35"/>
+    <w:rsid w:val="00961e35"/>
     <w:pPr>
-      <w:spacing w:line="240" w:lineRule="auto"/>
+      <w:spacing w:lineRule="auto" w:line="240"/>
     </w:pPr>
     <w:rPr>
       <w:rFonts w:ascii="Tahoma" w:hAnsi="Tahoma" w:cs="Tahoma"/>
@@ -1426,50 +1717,73 @@
       <w:szCs w:val="16"/>
     </w:rPr>
   </w:style>
-  <w:style w:type="paragraph" w:customStyle="1" w:styleId="FrameContents">
+  <w:style w:type="paragraph" w:styleId="FrameContents" w:customStyle="1">
     <w:name w:val="Frame Contents"/>
     <w:basedOn w:val="Normal"/>
     <w:qFormat/>
+    <w:pPr/>
+    <w:rPr/>
+  </w:style>
+  <w:style w:type="numbering" w:styleId="Semlista" w:default="1">
+    <w:name w:val="Sem lista"/>
+    <w:uiPriority w:val="99"/>
+    <w:semiHidden/>
+    <w:unhideWhenUsed/>
+    <w:qFormat/>
+  </w:style>
+  <w:style w:type="table" w:default="1" w:styleId="Tabelanormal">
+    <w:name w:val="Normal Table"/>
+    <w:uiPriority w:val="99"/>
+    <w:semiHidden/>
+    <w:unhideWhenUsed/>
+    <w:tblPr>
+      <w:tblCellMar>
+        <w:top w:w="0" w:type="dxa"/>
+        <w:left w:w="108" w:type="dxa"/>
+        <w:bottom w:w="0" w:type="dxa"/>
+        <w:right w:w="108" w:type="dxa"/>
+      </w:tblCellMar>
+    </w:tblPr>
   </w:style>
 </w:styles>
 </file>
 
 <file path=word/theme/theme1.xml><?xml version="1.0" encoding="utf-8"?>
-<a:theme xmlns:a="http://schemas.openxmlformats.org/drawingml/2006/main" name="Tema do Office">
+<a:theme xmlns:a="http://schemas.openxmlformats.org/drawingml/2006/main" xmlns:r="http://schemas.openxmlformats.org/officeDocument/2006/relationships" name="Tema do Office">
   <a:themeElements>
     <a:clrScheme name="Escritório">
       <a:dk1>
-        <a:sysClr val="windowText" lastClr="000000"/>
+        <a:srgbClr val="000000"/>
       </a:dk1>
       <a:lt1>
-        <a:sysClr val="window" lastClr="FFFFFF"/>
+        <a:srgbClr val="ffffff"/>
       </a:lt1>
       <a:dk2>
-        <a:srgbClr val="1F497D"/>
+        <a:srgbClr val="1f497d"/>
       </a:dk2>
       <a:lt2>
-        <a:srgbClr val="EEECE1"/>
+        <a:srgbClr val="eeece1"/>
       </a:lt2>
       <a:accent1>
-        <a:srgbClr val="4F81BD"/>
+        <a:srgbClr val="4f81bd"/>
       </a:accent1>
       <a:accent2>
-        <a:srgbClr val="C0504D"/>
+        <a:srgbClr val="c0504d"/>
       </a:accent2>
       <a:accent3>
-        <a:srgbClr val="9BBB59"/>
+        <a:srgbClr val="9bbb59"/>
       </a:accent3>
       <a:accent4>
-        <a:srgbClr val="8064A2"/>
+        <a:srgbClr val="8064a2"/>
       </a:accent4>
       <a:accent5>
-        <a:srgbClr val="4BACC6"/>
+        <a:srgbClr val="4bacc6"/>
       </a:accent5>
       <a:accent6>
-        <a:srgbClr val="F79646"/>
+        <a:srgbClr val="f79646"/>
       </a:accent6>
       <a:hlink>
-        <a:srgbClr val="0000FF"/>
+        <a:srgbClr val="0000ff"/>
       </a:hlink>
       <a:folHlink>
         <a:srgbClr val="800080"/>
@@ -1477,242 +1791,134 @@
     </a:clrScheme>
     <a:fontScheme name="Escritório">
       <a:majorFont>
-        <a:latin typeface="Cambria"/>
+        <a:latin typeface="Cambria" pitchFamily="0" charset="1"/>
         <a:ea typeface=""/>
         <a:cs typeface=""/>
-        <a:font script="Jpan" typeface="ＭＳ ゴシック"/>
-        <a:font script="Hang" typeface="맑은 고딕"/>
-        <a:font script="Hans" typeface="宋体"/>
-        <a:font script="Hant" typeface="新細明體"/>
-        <a:font script="Arab" typeface="Times New Roman"/>
-        <a:font script="Hebr" typeface="Times New Roman"/>
-        <a:font script="Thai" typeface="Angsana New"/>
-        <a:font script="Ethi" typeface="Nyala"/>
-        <a:font script="Beng" typeface="Vrinda"/>
-        <a:font script="Gujr" typeface="Shruti"/>
-        <a:font script="Khmr" typeface="MoolBoran"/>
-        <a:font script="Knda" typeface="Tunga"/>
-        <a:font script="Guru" typeface="Raavi"/>
-        <a:font script="Cans" typeface="Euphemia"/>
-        <a:font script="Cher" typeface="Plantagenet Cherokee"/>
-        <a:font script="Yiii" typeface="Microsoft Yi Baiti"/>
-        <a:font script="Tibt" typeface="Microsoft Himalaya"/>
-        <a:font script="Thaa" typeface="MV Boli"/>
-        <a:font script="Deva" typeface="Mangal"/>
-        <a:font script="Telu" typeface="Gautami"/>
-        <a:font script="Taml" typeface="Latha"/>
-        <a:font script="Syrc" typeface="Estrangelo Edessa"/>
-        <a:font script="Orya" typeface="Kalinga"/>
-        <a:font script="Mlym" typeface="Kartika"/>
-        <a:font script="Laoo" typeface="DokChampa"/>
-        <a:font script="Sinh" typeface="Iskoola Pota"/>
-        <a:font script="Mong" typeface="Mongolian Baiti"/>
-        <a:font script="Viet" typeface="Times New Roman"/>
-        <a:font script="Uigh" typeface="Microsoft Uighur"/>
       </a:majorFont>
       <a:minorFont>
-        <a:latin typeface="Calibri"/>
+        <a:latin typeface="Calibri" pitchFamily="0" charset="1"/>
         <a:ea typeface=""/>
         <a:cs typeface=""/>
-        <a:font script="Jpan" typeface="ＭＳ 明朝"/>
-        <a:font script="Hang" typeface="맑은 고딕"/>
-        <a:font script="Hans" typeface="宋体"/>
-        <a:font script="Hant" typeface="新細明體"/>
-        <a:font script="Arab" typeface="Arial"/>
-        <a:font script="Hebr" typeface="Arial"/>
-        <a:font script="Thai" typeface="Cordia New"/>
-        <a:font script="Ethi" typeface="Nyala"/>
-        <a:font script="Beng" typeface="Vrinda"/>
-        <a:font script="Gujr" typeface="Shruti"/>
-        <a:font script="Khmr" typeface="DaunPenh"/>
-        <a:font script="Knda" typeface="Tunga"/>
-        <a:font script="Guru" typeface="Raavi"/>
-        <a:font script="Cans" typeface="Euphemia"/>
-        <a:font script="Cher" typeface="Plantagenet Cherokee"/>
-        <a:font script="Yiii" typeface="Microsoft Yi Baiti"/>
-        <a:font script="Tibt" typeface="Microsoft Himalaya"/>
-        <a:font script="Thaa" typeface="MV Boli"/>
-        <a:font script="Deva" typeface="Mangal"/>
-        <a:font script="Telu" typeface="Gautami"/>
-        <a:font script="Taml" typeface="Latha"/>
-        <a:font script="Syrc" typeface="Estrangelo Edessa"/>
-        <a:font script="Orya" typeface="Kalinga"/>
-        <a:font script="Mlym" typeface="Kartika"/>
-        <a:font script="Laoo" typeface="DokChampa"/>
-        <a:font script="Sinh" typeface="Iskoola Pota"/>
-        <a:font script="Mong" typeface="Mongolian Baiti"/>
-        <a:font script="Viet" typeface="Arial"/>
-        <a:font script="Uigh" typeface="Microsoft Uighur"/>
       </a:minorFont>
     </a:fontScheme>
-    <a:fmtScheme name="Escritório">
+    <a:fmtScheme>
       <a:fillStyleLst>
         <a:solidFill>
           <a:schemeClr val="phClr"/>
         </a:solidFill>
-        <a:gradFill rotWithShape="1">
+        <a:gradFill>
           <a:gsLst>
             <a:gs pos="0">
               <a:schemeClr val="phClr">
                 <a:tint val="50000"/>
-                <a:satMod val="300000"/>
               </a:schemeClr>
             </a:gs>
             <a:gs pos="35000">
               <a:schemeClr val="phClr">
                 <a:tint val="37000"/>
-                <a:satMod val="300000"/>
               </a:schemeClr>
             </a:gs>
             <a:gs pos="100000">
               <a:schemeClr val="phClr">
                 <a:tint val="15000"/>
-                <a:satMod val="350000"/>
               </a:schemeClr>
             </a:gs>
           </a:gsLst>
           <a:lin ang="16200000" scaled="1"/>
+          <a:tileRect l="0" t="0" r="0" b="0"/>
         </a:gradFill>
-        <a:gradFill rotWithShape="1">
+        <a:gradFill>
           <a:gsLst>
             <a:gs pos="0">
               <a:schemeClr val="phClr">
                 <a:shade val="51000"/>
-                <a:satMod val="130000"/>
               </a:schemeClr>
             </a:gs>
             <a:gs pos="80000">
               <a:schemeClr val="phClr">
                 <a:shade val="93000"/>
-                <a:satMod val="130000"/>
               </a:schemeClr>
             </a:gs>
             <a:gs pos="100000">
               <a:schemeClr val="phClr">
                 <a:shade val="94000"/>
-                <a:satMod val="135000"/>
               </a:schemeClr>
             </a:gs>
           </a:gsLst>
           <a:lin ang="16200000" scaled="0"/>
+          <a:tileRect l="0" t="0" r="0" b="0"/>
         </a:gradFill>
       </a:fillStyleLst>
       <a:lnStyleLst>
         <a:ln w="9525" cap="flat" cmpd="sng" algn="ctr">
-          <a:solidFill>
-            <a:schemeClr val="phClr">
-              <a:shade val="95000"/>
-              <a:satMod val="105000"/>
-            </a:schemeClr>
-          </a:solidFill>
           <a:prstDash val="solid"/>
         </a:ln>
         <a:ln w="25400" cap="flat" cmpd="sng" algn="ctr">
-          <a:solidFill>
-            <a:schemeClr val="phClr"/>
-          </a:solidFill>
           <a:prstDash val="solid"/>
         </a:ln>
         <a:ln w="38100" cap="flat" cmpd="sng" algn="ctr">
-          <a:solidFill>
-            <a:schemeClr val="phClr"/>
-          </a:solidFill>
           <a:prstDash val="solid"/>
         </a:ln>
       </a:lnStyleLst>
       <a:effectStyleLst>
         <a:effectStyle>
-          <a:effectLst>
-            <a:outerShdw blurRad="40000" dist="20000" dir="5400000" rotWithShape="0">
-              <a:srgbClr val="000000">
-                <a:alpha val="38000"/>
-              </a:srgbClr>
-            </a:outerShdw>
-          </a:effectLst>
+          <a:effectLst/>
         </a:effectStyle>
         <a:effectStyle>
-          <a:effectLst>
-            <a:outerShdw blurRad="40000" dist="23000" dir="5400000" rotWithShape="0">
-              <a:srgbClr val="000000">
-                <a:alpha val="35000"/>
-              </a:srgbClr>
-            </a:outerShdw>
-          </a:effectLst>
+          <a:effectLst/>
         </a:effectStyle>
         <a:effectStyle>
-          <a:effectLst>
-            <a:outerShdw blurRad="40000" dist="23000" dir="5400000" rotWithShape="0">
-              <a:srgbClr val="000000">
-                <a:alpha val="35000"/>
-              </a:srgbClr>
-            </a:outerShdw>
-          </a:effectLst>
-          <a:scene3d>
-            <a:camera prst="orthographicFront">
-              <a:rot lat="0" lon="0" rev="0"/>
-            </a:camera>
-            <a:lightRig rig="threePt" dir="t">
-              <a:rot lat="0" lon="0" rev="1200000"/>
-            </a:lightRig>
-          </a:scene3d>
-          <a:sp3d>
-            <a:bevelT w="63500" h="25400"/>
-          </a:sp3d>
+          <a:effectLst/>
         </a:effectStyle>
       </a:effectStyleLst>
       <a:bgFillStyleLst>
         <a:solidFill>
           <a:schemeClr val="phClr"/>
         </a:solidFill>
-        <a:gradFill rotWithShape="1">
+        <a:gradFill>
           <a:gsLst>
             <a:gs pos="0">
               <a:schemeClr val="phClr">
                 <a:tint val="40000"/>
-                <a:satMod val="350000"/>
               </a:schemeClr>
             </a:gs>
             <a:gs pos="40000">
               <a:schemeClr val="phClr">
                 <a:tint val="45000"/>
                 <a:shade val="99000"/>
-                <a:satMod val="350000"/>
               </a:schemeClr>
             </a:gs>
             <a:gs pos="100000">
               <a:schemeClr val="phClr">
                 <a:shade val="20000"/>
-                <a:satMod val="255000"/>
               </a:schemeClr>
             </a:gs>
           </a:gsLst>
           <a:path path="circle">
             <a:fillToRect l="50000" t="-80000" r="50000" b="180000"/>
           </a:path>
+          <a:tileRect l="0" t="0" r="0" b="0"/>
         </a:gradFill>
-        <a:gradFill rotWithShape="1">
+        <a:gradFill>
           <a:gsLst>
             <a:gs pos="0">
               <a:schemeClr val="phClr">
                 <a:tint val="80000"/>
-                <a:satMod val="300000"/>
               </a:schemeClr>
             </a:gs>
             <a:gs pos="100000">
               <a:schemeClr val="phClr">
                 <a:shade val="30000"/>
-                <a:satMod val="200000"/>
               </a:schemeClr>
             </a:gs>
           </a:gsLst>
           <a:path path="circle">
             <a:fillToRect l="50000" t="50000" r="50000" b="50000"/>
           </a:path>
+          <a:tileRect l="0" t="0" r="0" b="0"/>
         </a:gradFill>
       </a:bgFillStyleLst>
     </a:fmtScheme>
   </a:themeElements>
-  <a:objectDefaults/>
-  <a:extraClrSchemeLst/>
 </a:theme>
 </file>
</xml_diff>